<commit_message>
Clarify horizon MPC comparison and QP timing
</commit_message>
<xml_diff>
--- a/homework7_2/deliverables/第七章_习题7-2_预测时域实验报告.docx
+++ b/homework7_2/deliverables/第七章_习题7-2_预测时域实验报告.docx
@@ -149,7 +149,7 @@
               <w:rPr>
                 <w:b/>
               </w:rPr>
-              <w:t>OSQP 均值 ms</w:t>
+              <w:t>单次 QP 中位 ms</w:t>
             </w:r>
           </w:p>
         </w:tc>
@@ -266,7 +266,7 @@
           </w:tcPr>
           <w:p>
             <w:r>
-              <w:t>0.508</w:t>
+              <w:t>0.078</w:t>
             </w:r>
           </w:p>
         </w:tc>
@@ -276,7 +276,7 @@
           </w:tcPr>
           <w:p>
             <w:r>
-              <w:t>2.904</w:t>
+              <w:t>3.264</w:t>
             </w:r>
           </w:p>
         </w:tc>
@@ -286,7 +286,7 @@
           </w:tcPr>
           <w:p>
             <w:r>
-              <w:t>30.773</w:t>
+              <w:t>32.076</w:t>
             </w:r>
           </w:p>
         </w:tc>
@@ -368,7 +368,7 @@
           </w:tcPr>
           <w:p>
             <w:r>
-              <w:t>0.486</w:t>
+              <w:t>0.111</w:t>
             </w:r>
           </w:p>
         </w:tc>
@@ -378,7 +378,7 @@
           </w:tcPr>
           <w:p>
             <w:r>
-              <w:t>2.951</w:t>
+              <w:t>3.387</w:t>
             </w:r>
           </w:p>
         </w:tc>
@@ -388,7 +388,7 @@
           </w:tcPr>
           <w:p>
             <w:r>
-              <w:t>34.081</w:t>
+              <w:t>38.480</w:t>
             </w:r>
           </w:p>
         </w:tc>
@@ -470,7 +470,7 @@
           </w:tcPr>
           <w:p>
             <w:r>
-              <w:t>1.993</w:t>
+              <w:t>0.228</w:t>
             </w:r>
           </w:p>
         </w:tc>
@@ -480,7 +480,7 @@
           </w:tcPr>
           <w:p>
             <w:r>
-              <w:t>4.764</w:t>
+              <w:t>5.535</w:t>
             </w:r>
           </w:p>
         </w:tc>
@@ -490,7 +490,7 @@
           </w:tcPr>
           <w:p>
             <w:r>
-              <w:t>47.458</w:t>
+              <w:t>53.634</w:t>
             </w:r>
           </w:p>
         </w:tc>
@@ -572,7 +572,7 @@
           </w:tcPr>
           <w:p>
             <w:r>
-              <w:t>5.254</w:t>
+              <w:t>0.367</w:t>
             </w:r>
           </w:p>
         </w:tc>
@@ -582,7 +582,7 @@
           </w:tcPr>
           <w:p>
             <w:r>
-              <w:t>8.127</w:t>
+              <w:t>9.051</w:t>
             </w:r>
           </w:p>
         </w:tc>
@@ -592,7 +592,7 @@
           </w:tcPr>
           <w:p>
             <w:r>
-              <w:t>57.173</w:t>
+              <w:t>64.548</w:t>
             </w:r>
           </w:p>
         </w:tc>
@@ -674,7 +674,7 @@
           </w:tcPr>
           <w:p>
             <w:r>
-              <w:t>17.140</w:t>
+              <w:t>0.789</w:t>
             </w:r>
           </w:p>
         </w:tc>
@@ -684,7 +684,7 @@
           </w:tcPr>
           <w:p>
             <w:r>
-              <w:t>20.447</w:t>
+              <w:t>21.254</w:t>
             </w:r>
           </w:p>
         </w:tc>
@@ -694,7 +694,7 @@
           </w:tcPr>
           <w:p>
             <w:r>
-              <w:t>75.752</w:t>
+              <w:t>82.153</w:t>
             </w:r>
           </w:p>
         </w:tc>
@@ -776,7 +776,7 @@
           </w:tcPr>
           <w:p>
             <w:r>
-              <w:t>41.968</w:t>
+              <w:t>1.672</w:t>
             </w:r>
           </w:p>
         </w:tc>
@@ -786,7 +786,7 @@
           </w:tcPr>
           <w:p>
             <w:r>
-              <w:t>46.141</w:t>
+              <w:t>50.971</w:t>
             </w:r>
           </w:p>
         </w:tc>
@@ -796,7 +796,7 @@
           </w:tcPr>
           <w:p>
             <w:r>
-              <w:t>95.812</w:t>
+              <w:t>102.111</w:t>
             </w:r>
           </w:p>
         </w:tc>
@@ -878,7 +878,7 @@
           </w:tcPr>
           <w:p>
             <w:r>
-              <w:t>110.475</w:t>
+              <w:t>2.374</w:t>
             </w:r>
           </w:p>
         </w:tc>
@@ -888,7 +888,7 @@
           </w:tcPr>
           <w:p>
             <w:r>
-              <w:t>114.763</w:t>
+              <w:t>120.934</w:t>
             </w:r>
           </w:p>
         </w:tc>
@@ -898,7 +898,7 @@
           </w:tcPr>
           <w:p>
             <w:r>
-              <w:t>110.081</w:t>
+              <w:t>119.544</w:t>
             </w:r>
           </w:p>
         </w:tc>
@@ -936,7 +936,7 @@
     </w:tbl>
     <w:p>
       <w:r>
-        <w:t>OSQP 均值来自底层求解器记录；CVXPY 均值是每次 Problem.solve 的实际墙钟时间；完整控制时间还含模型预测和非线性验证。三者不能互换。表中平均耗时只统计完成的QP 控制步骤；所有数值保存在逐步 CSV 和求解日志中。</w:t>
+        <w:t>单次 QP 中位数逐次统计 OSQP 底层求解时间，与图 (d) 口径一致；CVXPY 栏为每控制周期内 Problem.solve 的墙钟时间合计均值；完整控制时间还含模型预测和非线性验证。三者不能互换。所有数值保存在逐步 CSV 和求解日志中。</w:t>
       </w:r>
     </w:p>
     <w:tbl>
@@ -946,17 +946,18 @@
         <w:tblLook w:firstColumn="1" w:firstRow="1" w:lastColumn="0" w:lastRow="0" w:noHBand="0" w:noVBand="1" w:val="04A0"/>
       </w:tblPr>
       <w:tblGrid>
-        <w:gridCol w:w="2479"/>
-        <w:gridCol w:w="2479"/>
-        <w:gridCol w:w="2479"/>
-        <w:gridCol w:w="2479"/>
-        <w:gridCol w:w="2479"/>
-        <w:gridCol w:w="2479"/>
+        <w:gridCol w:w="2125"/>
+        <w:gridCol w:w="2125"/>
+        <w:gridCol w:w="2125"/>
+        <w:gridCol w:w="2125"/>
+        <w:gridCol w:w="2125"/>
+        <w:gridCol w:w="2125"/>
+        <w:gridCol w:w="2125"/>
       </w:tblGrid>
       <w:tr>
         <w:tc>
           <w:tcPr>
-            <w:tcW w:type="dxa" w:w="2479"/>
+            <w:tcW w:type="dxa" w:w="2125"/>
           </w:tcPr>
           <w:p>
             <w:r>
@@ -969,33 +970,46 @@
         </w:tc>
         <w:tc>
           <w:tcPr>
-            <w:tcW w:type="dxa" w:w="2479"/>
+            <w:tcW w:type="dxa" w:w="2125"/>
           </w:tcPr>
           <w:p>
             <w:r>
               <w:rPr>
                 <w:b/>
               </w:rPr>
-              <w:t>OSQP P95 ms</w:t>
+              <w:t>单次 QP P95 ms</w:t>
             </w:r>
           </w:p>
         </w:tc>
         <w:tc>
           <w:tcPr>
-            <w:tcW w:type="dxa" w:w="2479"/>
+            <w:tcW w:type="dxa" w:w="2125"/>
           </w:tcPr>
           <w:p>
             <w:r>
               <w:rPr>
                 <w:b/>
               </w:rPr>
-              <w:t>CVXPY P95 ms</w:t>
+              <w:t>周期 QP 均值 ms</w:t>
             </w:r>
           </w:p>
         </w:tc>
         <w:tc>
           <w:tcPr>
-            <w:tcW w:type="dxa" w:w="2479"/>
+            <w:tcW w:type="dxa" w:w="2125"/>
+          </w:tcPr>
+          <w:p>
+            <w:r>
+              <w:rPr>
+                <w:b/>
+              </w:rPr>
+              <w:t>周期 CVXPY P95 ms</w:t>
+            </w:r>
+          </w:p>
+        </w:tc>
+        <w:tc>
+          <w:tcPr>
+            <w:tcW w:type="dxa" w:w="2125"/>
           </w:tcPr>
           <w:p>
             <w:r>
@@ -1008,7 +1022,7 @@
         </w:tc>
         <w:tc>
           <w:tcPr>
-            <w:tcW w:type="dxa" w:w="2479"/>
+            <w:tcW w:type="dxa" w:w="2125"/>
           </w:tcPr>
           <w:p>
             <w:r>
@@ -1021,7 +1035,7 @@
         </w:tc>
         <w:tc>
           <w:tcPr>
-            <w:tcW w:type="dxa" w:w="2479"/>
+            <w:tcW w:type="dxa" w:w="2125"/>
           </w:tcPr>
           <w:p>
             <w:r>
@@ -1036,7 +1050,7 @@
       <w:tr>
         <w:tc>
           <w:tcPr>
-            <w:tcW w:type="dxa" w:w="2479"/>
+            <w:tcW w:type="dxa" w:w="2125"/>
           </w:tcPr>
           <w:p>
             <w:r>
@@ -1046,37 +1060,47 @@
         </w:tc>
         <w:tc>
           <w:tcPr>
-            <w:tcW w:type="dxa" w:w="2479"/>
+            <w:tcW w:type="dxa" w:w="2125"/>
           </w:tcPr>
           <w:p>
             <w:r>
-              <w:t>1.303</w:t>
+              <w:t>0.587</w:t>
             </w:r>
           </w:p>
         </w:tc>
         <w:tc>
           <w:tcPr>
-            <w:tcW w:type="dxa" w:w="2479"/>
+            <w:tcW w:type="dxa" w:w="2125"/>
           </w:tcPr>
           <w:p>
             <w:r>
-              <w:t>4.765</w:t>
+              <w:t>0.534</w:t>
             </w:r>
           </w:p>
         </w:tc>
         <w:tc>
           <w:tcPr>
-            <w:tcW w:type="dxa" w:w="2479"/>
+            <w:tcW w:type="dxa" w:w="2125"/>
           </w:tcPr>
           <w:p>
             <w:r>
-              <w:t>328.060</w:t>
+              <w:t>5.180</w:t>
             </w:r>
           </w:p>
         </w:tc>
         <w:tc>
           <w:tcPr>
-            <w:tcW w:type="dxa" w:w="2479"/>
+            <w:tcW w:type="dxa" w:w="2125"/>
+          </w:tcPr>
+          <w:p>
+            <w:r>
+              <w:t>356.435</w:t>
+            </w:r>
+          </w:p>
+        </w:tc>
+        <w:tc>
+          <w:tcPr>
+            <w:tcW w:type="dxa" w:w="2125"/>
           </w:tcPr>
           <w:p>
             <w:r>
@@ -1086,7 +1110,7 @@
         </w:tc>
         <w:tc>
           <w:tcPr>
-            <w:tcW w:type="dxa" w:w="2479"/>
+            <w:tcW w:type="dxa" w:w="2125"/>
           </w:tcPr>
           <w:p>
             <w:r>
@@ -1098,7 +1122,7 @@
       <w:tr>
         <w:tc>
           <w:tcPr>
-            <w:tcW w:type="dxa" w:w="2479"/>
+            <w:tcW w:type="dxa" w:w="2125"/>
           </w:tcPr>
           <w:p>
             <w:r>
@@ -1108,37 +1132,47 @@
         </w:tc>
         <w:tc>
           <w:tcPr>
-            <w:tcW w:type="dxa" w:w="2479"/>
+            <w:tcW w:type="dxa" w:w="2125"/>
           </w:tcPr>
           <w:p>
             <w:r>
-              <w:t>1.522</w:t>
+              <w:t>0.891</w:t>
             </w:r>
           </w:p>
         </w:tc>
         <w:tc>
           <w:tcPr>
-            <w:tcW w:type="dxa" w:w="2479"/>
+            <w:tcW w:type="dxa" w:w="2125"/>
           </w:tcPr>
           <w:p>
             <w:r>
-              <w:t>5.666</w:t>
+              <w:t>0.513</w:t>
             </w:r>
           </w:p>
         </w:tc>
         <w:tc>
           <w:tcPr>
-            <w:tcW w:type="dxa" w:w="2479"/>
+            <w:tcW w:type="dxa" w:w="2125"/>
           </w:tcPr>
           <w:p>
             <w:r>
-              <w:t>462.703</w:t>
+              <w:t>6.518</w:t>
             </w:r>
           </w:p>
         </w:tc>
         <w:tc>
           <w:tcPr>
-            <w:tcW w:type="dxa" w:w="2479"/>
+            <w:tcW w:type="dxa" w:w="2125"/>
+          </w:tcPr>
+          <w:p>
+            <w:r>
+              <w:t>507.698</w:t>
+            </w:r>
+          </w:p>
+        </w:tc>
+        <w:tc>
+          <w:tcPr>
+            <w:tcW w:type="dxa" w:w="2125"/>
           </w:tcPr>
           <w:p>
             <w:r>
@@ -1148,7 +1182,7 @@
         </w:tc>
         <w:tc>
           <w:tcPr>
-            <w:tcW w:type="dxa" w:w="2479"/>
+            <w:tcW w:type="dxa" w:w="2125"/>
           </w:tcPr>
           <w:p>
             <w:r>
@@ -1160,7 +1194,7 @@
       <w:tr>
         <w:tc>
           <w:tcPr>
-            <w:tcW w:type="dxa" w:w="2479"/>
+            <w:tcW w:type="dxa" w:w="2125"/>
           </w:tcPr>
           <w:p>
             <w:r>
@@ -1170,37 +1204,47 @@
         </w:tc>
         <w:tc>
           <w:tcPr>
-            <w:tcW w:type="dxa" w:w="2479"/>
+            <w:tcW w:type="dxa" w:w="2125"/>
           </w:tcPr>
           <w:p>
             <w:r>
-              <w:t>9.338</w:t>
+              <w:t>4.312</w:t>
             </w:r>
           </w:p>
         </w:tc>
         <w:tc>
           <w:tcPr>
-            <w:tcW w:type="dxa" w:w="2479"/>
+            <w:tcW w:type="dxa" w:w="2125"/>
           </w:tcPr>
           <w:p>
             <w:r>
-              <w:t>15.587</w:t>
+              <w:t>2.149</w:t>
             </w:r>
           </w:p>
         </w:tc>
         <w:tc>
           <w:tcPr>
-            <w:tcW w:type="dxa" w:w="2479"/>
+            <w:tcW w:type="dxa" w:w="2125"/>
           </w:tcPr>
           <w:p>
             <w:r>
-              <w:t>698.335</w:t>
+              <w:t>15.389</w:t>
             </w:r>
           </w:p>
         </w:tc>
         <w:tc>
           <w:tcPr>
-            <w:tcW w:type="dxa" w:w="2479"/>
+            <w:tcW w:type="dxa" w:w="2125"/>
+          </w:tcPr>
+          <w:p>
+            <w:r>
+              <w:t>740.586</w:t>
+            </w:r>
+          </w:p>
+        </w:tc>
+        <w:tc>
+          <w:tcPr>
+            <w:tcW w:type="dxa" w:w="2125"/>
           </w:tcPr>
           <w:p>
             <w:r>
@@ -1210,7 +1254,7 @@
         </w:tc>
         <w:tc>
           <w:tcPr>
-            <w:tcW w:type="dxa" w:w="2479"/>
+            <w:tcW w:type="dxa" w:w="2125"/>
           </w:tcPr>
           <w:p>
             <w:r>
@@ -1222,7 +1266,7 @@
       <w:tr>
         <w:tc>
           <w:tcPr>
-            <w:tcW w:type="dxa" w:w="2479"/>
+            <w:tcW w:type="dxa" w:w="2125"/>
           </w:tcPr>
           <w:p>
             <w:r>
@@ -1232,37 +1276,47 @@
         </w:tc>
         <w:tc>
           <w:tcPr>
-            <w:tcW w:type="dxa" w:w="2479"/>
+            <w:tcW w:type="dxa" w:w="2125"/>
           </w:tcPr>
           <w:p>
             <w:r>
-              <w:t>24.463</w:t>
+              <w:t>9.891</w:t>
             </w:r>
           </w:p>
         </w:tc>
         <w:tc>
           <w:tcPr>
-            <w:tcW w:type="dxa" w:w="2479"/>
+            <w:tcW w:type="dxa" w:w="2125"/>
           </w:tcPr>
           <w:p>
             <w:r>
-              <w:t>28.135</w:t>
+              <w:t>5.636</w:t>
             </w:r>
           </w:p>
         </w:tc>
         <w:tc>
           <w:tcPr>
-            <w:tcW w:type="dxa" w:w="2479"/>
+            <w:tcW w:type="dxa" w:w="2125"/>
           </w:tcPr>
           <w:p>
             <w:r>
-              <w:t>848.125</w:t>
+              <w:t>30.752</w:t>
             </w:r>
           </w:p>
         </w:tc>
         <w:tc>
           <w:tcPr>
-            <w:tcW w:type="dxa" w:w="2479"/>
+            <w:tcW w:type="dxa" w:w="2125"/>
+          </w:tcPr>
+          <w:p>
+            <w:r>
+              <w:t>896.320</w:t>
+            </w:r>
+          </w:p>
+        </w:tc>
+        <w:tc>
+          <w:tcPr>
+            <w:tcW w:type="dxa" w:w="2125"/>
           </w:tcPr>
           <w:p>
             <w:r>
@@ -1272,7 +1326,7 @@
         </w:tc>
         <w:tc>
           <w:tcPr>
-            <w:tcW w:type="dxa" w:w="2479"/>
+            <w:tcW w:type="dxa" w:w="2125"/>
           </w:tcPr>
           <w:p>
             <w:r>
@@ -1284,7 +1338,7 @@
       <w:tr>
         <w:tc>
           <w:tcPr>
-            <w:tcW w:type="dxa" w:w="2479"/>
+            <w:tcW w:type="dxa" w:w="2125"/>
           </w:tcPr>
           <w:p>
             <w:r>
@@ -1294,37 +1348,47 @@
         </w:tc>
         <w:tc>
           <w:tcPr>
-            <w:tcW w:type="dxa" w:w="2479"/>
+            <w:tcW w:type="dxa" w:w="2125"/>
           </w:tcPr>
           <w:p>
             <w:r>
-              <w:t>80.620</w:t>
+              <w:t>31.285</w:t>
             </w:r>
           </w:p>
         </w:tc>
         <w:tc>
           <w:tcPr>
-            <w:tcW w:type="dxa" w:w="2479"/>
+            <w:tcW w:type="dxa" w:w="2125"/>
           </w:tcPr>
           <w:p>
             <w:r>
-              <w:t>85.434</w:t>
+              <w:t>17.622</w:t>
             </w:r>
           </w:p>
         </w:tc>
         <w:tc>
           <w:tcPr>
-            <w:tcW w:type="dxa" w:w="2479"/>
+            <w:tcW w:type="dxa" w:w="2125"/>
           </w:tcPr>
           <w:p>
             <w:r>
-              <w:t>1152.338</w:t>
+              <w:t>88.171</w:t>
             </w:r>
           </w:p>
         </w:tc>
         <w:tc>
           <w:tcPr>
-            <w:tcW w:type="dxa" w:w="2479"/>
+            <w:tcW w:type="dxa" w:w="2125"/>
+          </w:tcPr>
+          <w:p>
+            <w:r>
+              <w:t>1151.929</w:t>
+            </w:r>
+          </w:p>
+        </w:tc>
+        <w:tc>
+          <w:tcPr>
+            <w:tcW w:type="dxa" w:w="2125"/>
           </w:tcPr>
           <w:p>
             <w:r>
@@ -1334,7 +1398,7 @@
         </w:tc>
         <w:tc>
           <w:tcPr>
-            <w:tcW w:type="dxa" w:w="2479"/>
+            <w:tcW w:type="dxa" w:w="2125"/>
           </w:tcPr>
           <w:p>
             <w:r>
@@ -1346,7 +1410,7 @@
       <w:tr>
         <w:tc>
           <w:tcPr>
-            <w:tcW w:type="dxa" w:w="2479"/>
+            <w:tcW w:type="dxa" w:w="2125"/>
           </w:tcPr>
           <w:p>
             <w:r>
@@ -1356,37 +1420,47 @@
         </w:tc>
         <w:tc>
           <w:tcPr>
-            <w:tcW w:type="dxa" w:w="2479"/>
+            <w:tcW w:type="dxa" w:w="2125"/>
           </w:tcPr>
           <w:p>
             <w:r>
-              <w:t>172.410</w:t>
+              <w:t>78.232</w:t>
             </w:r>
           </w:p>
         </w:tc>
         <w:tc>
           <w:tcPr>
-            <w:tcW w:type="dxa" w:w="2479"/>
+            <w:tcW w:type="dxa" w:w="2125"/>
           </w:tcPr>
           <w:p>
             <w:r>
-              <w:t>178.129</w:t>
+              <w:t>46.575</w:t>
             </w:r>
           </w:p>
         </w:tc>
         <w:tc>
           <w:tcPr>
-            <w:tcW w:type="dxa" w:w="2479"/>
+            <w:tcW w:type="dxa" w:w="2125"/>
           </w:tcPr>
           <w:p>
             <w:r>
-              <w:t>1438.400</w:t>
+              <w:t>199.136</w:t>
             </w:r>
           </w:p>
         </w:tc>
         <w:tc>
           <w:tcPr>
-            <w:tcW w:type="dxa" w:w="2479"/>
+            <w:tcW w:type="dxa" w:w="2125"/>
+          </w:tcPr>
+          <w:p>
+            <w:r>
+              <w:t>1754.221</w:t>
+            </w:r>
+          </w:p>
+        </w:tc>
+        <w:tc>
+          <w:tcPr>
+            <w:tcW w:type="dxa" w:w="2125"/>
           </w:tcPr>
           <w:p>
             <w:r>
@@ -1396,7 +1470,7 @@
         </w:tc>
         <w:tc>
           <w:tcPr>
-            <w:tcW w:type="dxa" w:w="2479"/>
+            <w:tcW w:type="dxa" w:w="2125"/>
           </w:tcPr>
           <w:p>
             <w:r>
@@ -1408,7 +1482,7 @@
       <w:tr>
         <w:tc>
           <w:tcPr>
-            <w:tcW w:type="dxa" w:w="2479"/>
+            <w:tcW w:type="dxa" w:w="2125"/>
           </w:tcPr>
           <w:p>
             <w:r>
@@ -1418,37 +1492,47 @@
         </w:tc>
         <w:tc>
           <w:tcPr>
-            <w:tcW w:type="dxa" w:w="2479"/>
+            <w:tcW w:type="dxa" w:w="2125"/>
           </w:tcPr>
           <w:p>
             <w:r>
-              <w:t>513.239</w:t>
+              <w:t>199.505</w:t>
             </w:r>
           </w:p>
         </w:tc>
         <w:tc>
           <w:tcPr>
-            <w:tcW w:type="dxa" w:w="2479"/>
+            <w:tcW w:type="dxa" w:w="2125"/>
           </w:tcPr>
           <w:p>
             <w:r>
-              <w:t>519.329</w:t>
+              <w:t>116.317</w:t>
             </w:r>
           </w:p>
         </w:tc>
         <w:tc>
           <w:tcPr>
-            <w:tcW w:type="dxa" w:w="2479"/>
+            <w:tcW w:type="dxa" w:w="2125"/>
           </w:tcPr>
           <w:p>
             <w:r>
-              <w:t>1895.473</w:t>
+              <w:t>531.738</w:t>
             </w:r>
           </w:p>
         </w:tc>
         <w:tc>
           <w:tcPr>
-            <w:tcW w:type="dxa" w:w="2479"/>
+            <w:tcW w:type="dxa" w:w="2125"/>
+          </w:tcPr>
+          <w:p>
+            <w:r>
+              <w:t>2028.190</w:t>
+            </w:r>
+          </w:p>
+        </w:tc>
+        <w:tc>
+          <w:tcPr>
+            <w:tcW w:type="dxa" w:w="2125"/>
           </w:tcPr>
           <w:p>
             <w:r>
@@ -1458,7 +1542,7 @@
         </w:tc>
         <w:tc>
           <w:tcPr>
-            <w:tcW w:type="dxa" w:w="2479"/>
+            <w:tcW w:type="dxa" w:w="2125"/>
           </w:tcPr>
           <w:p>
             <w:r>
@@ -1470,7 +1554,7 @@
     </w:tbl>
     <w:p>
       <w:r>
-        <w:t>采样周期 1 ms 是理论实时截止线；本表是在当前通用计算环境的观测时间，不能代替实时操作系统、指定处理器和最坏情况执行时间认证。</w:t>
+        <w:t>一周期内可能连续求解多个局部 QP，所以周期 QP 均值可能明显高于单次中位数。采样周期 1 ms 是理论实时截止线；本表是在当前通用计算环境的观测时间，不能代替实时操作系统、指定处理器和最坏情况执行时间认证。</w:t>
       </w:r>
     </w:p>
     <w:p>
@@ -1488,17 +1572,17 @@
     </w:p>
     <w:p>
       <w:r>
-        <w:t>N=5（短视，5 ms）完成：位移超调 5.295%，高密真实 P2 峰值 20.6532 MPa；有限网格压力可行恢复 6 次；经验证的移位计划再经有限网格改进 2 次。底层 OSQP 平均 0.508 ms，CVXPY 调用平均 2.904 ms，完整控制中位 30.773 ms。</w:t>
+        <w:t>N=5（短视，5 ms）完成：位移超调 5.295%，高密真实 P2 峰值 20.6532 MPa；有限网格压力可行恢复 6 次；经验证的移位计划再经有限网格改进 2 次。底层 OSQP 平均 0.534 ms，CVXPY 调用平均 3.264 ms，完整控制中位 32.076 ms。</w:t>
       </w:r>
     </w:p>
     <w:p>
       <w:r>
-        <w:t>N=20（基准，20 ms）完成：位移超调 0.466%，高密真实 P2 峰值 19.9020 MPa；有限网格压力可行恢复 0 次；经验证的移位计划再经有限网格改进 1 次。底层 OSQP 平均 5.254 ms，CVXPY 调用平均 8.127 ms，完整控制中位 57.173 ms。</w:t>
+        <w:t>N=20（基准，20 ms）完成：位移超调 0.466%，高密真实 P2 峰值 19.9020 MPa；有限网格压力可行恢复 0 次；经验证的移位计划再经有限网格改进 1 次。底层 OSQP 平均 5.636 ms，CVXPY 调用平均 9.051 ms，完整控制中位 64.548 ms。</w:t>
       </w:r>
     </w:p>
     <w:p>
       <w:r>
-        <w:t>N=50（长视，50 ms）完成：位移超调 0.360%，高密真实 P2 峰值 20.5629 MPa；有限网格压力可行恢复 1 次；经验证的移位计划再经有限网格改进 2 次。底层 OSQP 平均 110.475 ms，CVXPY 调用平均 114.763 ms，完整控制中位 110.081 ms。</w:t>
+        <w:t>N=50（长视，50 ms）完成：位移超调 0.360%，高密真实 P2 峰值 20.5629 MPa；有限网格压力可行恢复 1 次；经验证的移位计划再经有限网格改进 2 次。底层 OSQP 平均 116.317 ms，CVXPY 调用平均 120.934 ms，完整控制中位 119.544 ms。</w:t>
       </w:r>
     </w:p>
     <w:p>
@@ -1509,6 +1593,11 @@
     <w:p>
       <w:r>
         <w:t>本次七组完整闭环的高密真实压力峰值均未超过 21 MPa。有限仿真中守住安全线，不等于任意模型误差、扰动与实物系统均安全。当前硬约束针对 P2 上界，未保护 P1 上界或两腔压力下界。</w:t>
+      </w:r>
+    </w:p>
+    <w:p>
+      <w:r>
+        <w:t>与提供的课堂示意图相比，本回路的巡航与制动后 P2 基线更高。原因是当前四通阀的回油节流口与供油口采用相同系数，高速巡航需要回油压差；阀芯回中位后两腔封闭，且外泄漏系数为零，残余压力不能在几十毫秒内自动降回初始 2 MPa。参考图若体现近零巡航压力和快速卸压，需要另设回油/卸荷回路。本实验没有为匹配图形而修改压力数据、插入隐式卸压或裁剪峰值。</w:t>
       </w:r>
     </w:p>
     <w:p>
@@ -1562,7 +1651,7 @@
     </w:p>
     <w:p>
       <w:r>
-        <w:t>图 (a)–(c) 使用 N=5/20/50 的闭环样本、实际控制电压和高密 P2；图 (d) 绘制七组底层 QP 平均耗时与真实压力峰值。运行命令：python work_7_2.py；随后 python verify_experiment.py --strict；再运行 python package_delivery.py。源代码、配置、原始数据、逐步诊断、课件资料和 SHA256 清单均随 ZIP 一同提供。</w:t>
+        <w:t>图 (a)–(c) 使用 N=5/20/50 的闭环样本、实际控制电压和高密 P2；图 (d) 绘制七组单次 QP 耗时中位数、均值与真实压力峰值。运行命令：python work_7_2.py；随后 python verify_experiment.py --strict；再运行 python package_delivery.py。源代码、配置、原始数据、逐步诊断、课件资料、reference_comparison.md 差异诊断和 SHA256 清单均随 ZIP 一同提供。</w:t>
       </w:r>
     </w:p>
     <w:sectPr>

</xml_diff>

<commit_message>
Improve chapter 7 horizon comparison physical model and terminal braking
</commit_message>
<xml_diff>
--- a/homework7_2/deliverables/第七章_习题7-2_预测时域实验报告.docx
+++ b/homework7_2/deliverables/第七章_习题7-2_预测时域实验报告.docx
@@ -34,6 +34,11 @@
       </w:r>
     </w:p>
     <w:p>
+      <w:r>
+        <w:t>本次实验通过 teaching_plant_config.json 启用显式教学等效回路：伸出供油口与回油旁路分别设定流量能力，阀芯和活塞近静止时开放双腔压力调节支路。支路流量写入真实对象及预测模型的压力微分方程，不重置、平移或裁剪压力记录。此回路及参数依据参考图形提出，属于公开的课堂假设；单张参考图无法辨识真实装置的回路。移除 experiment_config.json 中的 plant_config_file 可运行原闭中位对称计量口对象。</w:t>
+      </w:r>
+    </w:p>
+    <w:p>
       <w:pPr>
         <w:pStyle w:val="Heading1"/>
       </w:pPr>
@@ -49,6 +54,11 @@
     <w:p>
       <w:r>
         <w:t>以位置/速度误差和电压增量构造凸二次目标，并将电压、电压增量及 P2 预测节点上界写成 A_qp·ΔU 的线性不等式。CVXPY 缓存满足 DPP 的问题结构，底层调用 OSQP；QP 解通过原始可行性和 KKT 残差校核后，仍需用非线性灰箱重新验证未来输入与压力。若局部 QP 无可用计划，程序可调用公开的有限网格恢复策略：测试投影后的候选控制序列，只接受经过同一非线性预测约束验证的序列，且把该步骤单独计数。此举不是纯 QP 求解成功，也不构成一般的递归可行性证明。</w:t>
+      </w:r>
+    </w:p>
+    <w:p>
+      <w:r>
+        <w:t>所有时域共用终端制动代价：终端速度权重乘以 10.0；以 8.0 ms 估计视野外的惯性滑行，平滑地惩罚预计停止位置超过目标。越程代价权重采用 35·exp[−N·Ts/4.0 ms]，对全部 N 使用同一公式；局部 QP 求其二次近似，非线性候选按原代价重新评分。这是控制器的终端预测假设，不代表新增物理制动器。</w:t>
       </w:r>
     </w:p>
     <w:p>
@@ -246,7 +256,7 @@
           </w:tcPr>
           <w:p>
             <w:r>
-              <w:t>5.295</w:t>
+              <w:t>1.919</w:t>
             </w:r>
           </w:p>
         </w:tc>
@@ -256,7 +266,7 @@
           </w:tcPr>
           <w:p>
             <w:r>
-              <w:t>20.6532</w:t>
+              <w:t>20.4063</w:t>
             </w:r>
           </w:p>
         </w:tc>
@@ -266,7 +276,7 @@
           </w:tcPr>
           <w:p>
             <w:r>
-              <w:t>0.078</w:t>
+              <w:t>0.046</w:t>
             </w:r>
           </w:p>
         </w:tc>
@@ -276,7 +286,7 @@
           </w:tcPr>
           <w:p>
             <w:r>
-              <w:t>3.264</w:t>
+              <w:t>2.822</w:t>
             </w:r>
           </w:p>
         </w:tc>
@@ -286,17 +296,7 @@
           </w:tcPr>
           <w:p>
             <w:r>
-              <w:t>32.076</w:t>
-            </w:r>
-          </w:p>
-        </w:tc>
-        <w:tc>
-          <w:tcPr>
-            <w:tcW w:type="dxa" w:w="1488"/>
-          </w:tcPr>
-          <w:p>
-            <w:r>
-              <w:t>6</w:t>
+              <w:t>24.719</w:t>
             </w:r>
           </w:p>
         </w:tc>
@@ -307,6 +307,16 @@
           <w:p>
             <w:r>
               <w:t>2</w:t>
+            </w:r>
+          </w:p>
+        </w:tc>
+        <w:tc>
+          <w:tcPr>
+            <w:tcW w:type="dxa" w:w="1488"/>
+          </w:tcPr>
+          <w:p>
+            <w:r>
+              <w:t>1</w:t>
             </w:r>
           </w:p>
         </w:tc>
@@ -348,7 +358,7 @@
           </w:tcPr>
           <w:p>
             <w:r>
-              <w:t>0.466</w:t>
+              <w:t>0.465</w:t>
             </w:r>
           </w:p>
         </w:tc>
@@ -358,7 +368,7 @@
           </w:tcPr>
           <w:p>
             <w:r>
-              <w:t>19.9020</w:t>
+              <w:t>20.1127</w:t>
             </w:r>
           </w:p>
         </w:tc>
@@ -368,7 +378,7 @@
           </w:tcPr>
           <w:p>
             <w:r>
-              <w:t>0.111</w:t>
+              <w:t>0.109</w:t>
             </w:r>
           </w:p>
         </w:tc>
@@ -378,7 +388,7 @@
           </w:tcPr>
           <w:p>
             <w:r>
-              <w:t>3.387</w:t>
+              <w:t>3.759</w:t>
             </w:r>
           </w:p>
         </w:tc>
@@ -388,7 +398,7 @@
           </w:tcPr>
           <w:p>
             <w:r>
-              <w:t>38.480</w:t>
+              <w:t>41.900</w:t>
             </w:r>
           </w:p>
         </w:tc>
@@ -408,7 +418,7 @@
           </w:tcPr>
           <w:p>
             <w:r>
-              <w:t>1</w:t>
+              <w:t>2</w:t>
             </w:r>
           </w:p>
         </w:tc>
@@ -450,7 +460,7 @@
           </w:tcPr>
           <w:p>
             <w:r>
-              <w:t>1.122</w:t>
+              <w:t>1.148</w:t>
             </w:r>
           </w:p>
         </w:tc>
@@ -460,7 +470,7 @@
           </w:tcPr>
           <w:p>
             <w:r>
-              <w:t>20.5041</w:t>
+              <w:t>20.4384</w:t>
             </w:r>
           </w:p>
         </w:tc>
@@ -470,7 +480,7 @@
           </w:tcPr>
           <w:p>
             <w:r>
-              <w:t>0.228</w:t>
+              <w:t>0.237</w:t>
             </w:r>
           </w:p>
         </w:tc>
@@ -480,7 +490,7 @@
           </w:tcPr>
           <w:p>
             <w:r>
-              <w:t>5.535</w:t>
+              <w:t>8.550</w:t>
             </w:r>
           </w:p>
         </w:tc>
@@ -490,7 +500,7 @@
           </w:tcPr>
           <w:p>
             <w:r>
-              <w:t>53.634</w:t>
+              <w:t>71.894</w:t>
             </w:r>
           </w:p>
         </w:tc>
@@ -552,7 +562,7 @@
           </w:tcPr>
           <w:p>
             <w:r>
-              <w:t>0.466</w:t>
+              <w:t>0.617</w:t>
             </w:r>
           </w:p>
         </w:tc>
@@ -562,7 +572,7 @@
           </w:tcPr>
           <w:p>
             <w:r>
-              <w:t>19.9020</w:t>
+              <w:t>20.4941</w:t>
             </w:r>
           </w:p>
         </w:tc>
@@ -572,7 +582,7 @@
           </w:tcPr>
           <w:p>
             <w:r>
-              <w:t>0.367</w:t>
+              <w:t>0.356</w:t>
             </w:r>
           </w:p>
         </w:tc>
@@ -582,7 +592,7 @@
           </w:tcPr>
           <w:p>
             <w:r>
-              <w:t>9.051</w:t>
+              <w:t>11.071</w:t>
             </w:r>
           </w:p>
         </w:tc>
@@ -592,7 +602,7 @@
           </w:tcPr>
           <w:p>
             <w:r>
-              <w:t>64.548</w:t>
+              <w:t>97.209</w:t>
             </w:r>
           </w:p>
         </w:tc>
@@ -612,7 +622,7 @@
           </w:tcPr>
           <w:p>
             <w:r>
-              <w:t>1</w:t>
+              <w:t>2</w:t>
             </w:r>
           </w:p>
         </w:tc>
@@ -654,7 +664,7 @@
           </w:tcPr>
           <w:p>
             <w:r>
-              <w:t>0.795</w:t>
+              <w:t>0.230</w:t>
             </w:r>
           </w:p>
         </w:tc>
@@ -664,7 +674,7 @@
           </w:tcPr>
           <w:p>
             <w:r>
-              <w:t>20.7168</w:t>
+              <w:t>20.5381</w:t>
             </w:r>
           </w:p>
         </w:tc>
@@ -674,7 +684,7 @@
           </w:tcPr>
           <w:p>
             <w:r>
-              <w:t>0.789</w:t>
+              <w:t>0.819</w:t>
             </w:r>
           </w:p>
         </w:tc>
@@ -684,7 +694,7 @@
           </w:tcPr>
           <w:p>
             <w:r>
-              <w:t>21.254</w:t>
+              <w:t>32.650</w:t>
             </w:r>
           </w:p>
         </w:tc>
@@ -694,7 +704,7 @@
           </w:tcPr>
           <w:p>
             <w:r>
-              <w:t>82.153</w:t>
+              <w:t>99.362</w:t>
             </w:r>
           </w:p>
         </w:tc>
@@ -714,7 +724,7 @@
           </w:tcPr>
           <w:p>
             <w:r>
-              <w:t>1</w:t>
+              <w:t>2</w:t>
             </w:r>
           </w:p>
         </w:tc>
@@ -756,7 +766,7 @@
           </w:tcPr>
           <w:p>
             <w:r>
-              <w:t>0.770</w:t>
+              <w:t>1.064</w:t>
             </w:r>
           </w:p>
         </w:tc>
@@ -766,7 +776,7 @@
           </w:tcPr>
           <w:p>
             <w:r>
-              <w:t>20.5911</w:t>
+              <w:t>20.6658</w:t>
             </w:r>
           </w:p>
         </w:tc>
@@ -776,7 +786,7 @@
           </w:tcPr>
           <w:p>
             <w:r>
-              <w:t>1.672</w:t>
+              <w:t>1.789</w:t>
             </w:r>
           </w:p>
         </w:tc>
@@ -786,7 +796,7 @@
           </w:tcPr>
           <w:p>
             <w:r>
-              <w:t>50.971</w:t>
+              <w:t>62.347</w:t>
             </w:r>
           </w:p>
         </w:tc>
@@ -796,7 +806,7 @@
           </w:tcPr>
           <w:p>
             <w:r>
-              <w:t>102.111</w:t>
+              <w:t>135.279</w:t>
             </w:r>
           </w:p>
         </w:tc>
@@ -816,7 +826,7 @@
           </w:tcPr>
           <w:p>
             <w:r>
-              <w:t>3</w:t>
+              <w:t>2</w:t>
             </w:r>
           </w:p>
         </w:tc>
@@ -858,7 +868,7 @@
           </w:tcPr>
           <w:p>
             <w:r>
-              <w:t>0.360</w:t>
+              <w:t>0.965</w:t>
             </w:r>
           </w:p>
         </w:tc>
@@ -868,7 +878,7 @@
           </w:tcPr>
           <w:p>
             <w:r>
-              <w:t>20.5629</w:t>
+              <w:t>20.4090</w:t>
             </w:r>
           </w:p>
         </w:tc>
@@ -878,7 +888,7 @@
           </w:tcPr>
           <w:p>
             <w:r>
-              <w:t>2.374</w:t>
+              <w:t>3.289</w:t>
             </w:r>
           </w:p>
         </w:tc>
@@ -888,7 +898,7 @@
           </w:tcPr>
           <w:p>
             <w:r>
-              <w:t>120.934</w:t>
+              <w:t>152.647</w:t>
             </w:r>
           </w:p>
         </w:tc>
@@ -898,7 +908,7 @@
           </w:tcPr>
           <w:p>
             <w:r>
-              <w:t>119.544</w:t>
+              <w:t>164.276</w:t>
             </w:r>
           </w:p>
         </w:tc>
@@ -908,7 +918,7 @@
           </w:tcPr>
           <w:p>
             <w:r>
-              <w:t>1</w:t>
+              <w:t>0</w:t>
             </w:r>
           </w:p>
         </w:tc>
@@ -918,7 +928,7 @@
           </w:tcPr>
           <w:p>
             <w:r>
-              <w:t>2</w:t>
+              <w:t>4</w:t>
             </w:r>
           </w:p>
         </w:tc>
@@ -1064,7 +1074,7 @@
           </w:tcPr>
           <w:p>
             <w:r>
-              <w:t>0.587</w:t>
+              <w:t>0.362</w:t>
             </w:r>
           </w:p>
         </w:tc>
@@ -1074,7 +1084,7 @@
           </w:tcPr>
           <w:p>
             <w:r>
-              <w:t>0.534</w:t>
+              <w:t>0.229</w:t>
             </w:r>
           </w:p>
         </w:tc>
@@ -1084,7 +1094,7 @@
           </w:tcPr>
           <w:p>
             <w:r>
-              <w:t>5.180</w:t>
+              <w:t>3.791</w:t>
             </w:r>
           </w:p>
         </w:tc>
@@ -1094,7 +1104,7 @@
           </w:tcPr>
           <w:p>
             <w:r>
-              <w:t>356.435</w:t>
+              <w:t>116.520</w:t>
             </w:r>
           </w:p>
         </w:tc>
@@ -1136,7 +1146,7 @@
           </w:tcPr>
           <w:p>
             <w:r>
-              <w:t>0.891</w:t>
+              <w:t>1.508</w:t>
             </w:r>
           </w:p>
         </w:tc>
@@ -1146,7 +1156,7 @@
           </w:tcPr>
           <w:p>
             <w:r>
-              <w:t>0.513</w:t>
+              <w:t>0.948</w:t>
             </w:r>
           </w:p>
         </w:tc>
@@ -1156,7 +1166,7 @@
           </w:tcPr>
           <w:p>
             <w:r>
-              <w:t>6.518</w:t>
+              <w:t>8.237</w:t>
             </w:r>
           </w:p>
         </w:tc>
@@ -1166,7 +1176,7 @@
           </w:tcPr>
           <w:p>
             <w:r>
-              <w:t>507.698</w:t>
+              <w:t>562.539</w:t>
             </w:r>
           </w:p>
         </w:tc>
@@ -1208,7 +1218,7 @@
           </w:tcPr>
           <w:p>
             <w:r>
-              <w:t>4.312</w:t>
+              <w:t>11.330</w:t>
             </w:r>
           </w:p>
         </w:tc>
@@ -1218,7 +1228,7 @@
           </w:tcPr>
           <w:p>
             <w:r>
-              <w:t>2.149</w:t>
+              <w:t>5.508</w:t>
             </w:r>
           </w:p>
         </w:tc>
@@ -1228,7 +1238,7 @@
           </w:tcPr>
           <w:p>
             <w:r>
-              <w:t>15.389</w:t>
+              <w:t>29.151</w:t>
             </w:r>
           </w:p>
         </w:tc>
@@ -1238,7 +1248,7 @@
           </w:tcPr>
           <w:p>
             <w:r>
-              <w:t>740.586</w:t>
+              <w:t>1049.283</w:t>
             </w:r>
           </w:p>
         </w:tc>
@@ -1280,7 +1290,7 @@
           </w:tcPr>
           <w:p>
             <w:r>
-              <w:t>9.891</w:t>
+              <w:t>13.199</w:t>
             </w:r>
           </w:p>
         </w:tc>
@@ -1290,7 +1300,7 @@
           </w:tcPr>
           <w:p>
             <w:r>
-              <w:t>5.636</w:t>
+              <w:t>8.053</w:t>
             </w:r>
           </w:p>
         </w:tc>
@@ -1300,7 +1310,7 @@
           </w:tcPr>
           <w:p>
             <w:r>
-              <w:t>30.752</w:t>
+              <w:t>45.818</w:t>
             </w:r>
           </w:p>
         </w:tc>
@@ -1310,7 +1320,7 @@
           </w:tcPr>
           <w:p>
             <w:r>
-              <w:t>896.320</w:t>
+              <w:t>1183.871</w:t>
             </w:r>
           </w:p>
         </w:tc>
@@ -1352,7 +1362,7 @@
           </w:tcPr>
           <w:p>
             <w:r>
-              <w:t>31.285</w:t>
+              <w:t>63.635</w:t>
             </w:r>
           </w:p>
         </w:tc>
@@ -1362,7 +1372,7 @@
           </w:tcPr>
           <w:p>
             <w:r>
-              <w:t>17.622</w:t>
+              <w:t>29.034</w:t>
             </w:r>
           </w:p>
         </w:tc>
@@ -1372,7 +1382,7 @@
           </w:tcPr>
           <w:p>
             <w:r>
-              <w:t>88.171</w:t>
+              <w:t>172.945</w:t>
             </w:r>
           </w:p>
         </w:tc>
@@ -1382,7 +1392,7 @@
           </w:tcPr>
           <w:p>
             <w:r>
-              <w:t>1151.929</w:t>
+              <w:t>1783.884</w:t>
             </w:r>
           </w:p>
         </w:tc>
@@ -1424,7 +1434,7 @@
           </w:tcPr>
           <w:p>
             <w:r>
-              <w:t>78.232</w:t>
+              <w:t>99.211</w:t>
             </w:r>
           </w:p>
         </w:tc>
@@ -1434,7 +1444,7 @@
           </w:tcPr>
           <w:p>
             <w:r>
-              <w:t>46.575</w:t>
+              <w:t>58.410</w:t>
             </w:r>
           </w:p>
         </w:tc>
@@ -1444,7 +1454,7 @@
           </w:tcPr>
           <w:p>
             <w:r>
-              <w:t>199.136</w:t>
+              <w:t>237.465</w:t>
             </w:r>
           </w:p>
         </w:tc>
@@ -1454,7 +1464,7 @@
           </w:tcPr>
           <w:p>
             <w:r>
-              <w:t>1754.221</w:t>
+              <w:t>2095.236</w:t>
             </w:r>
           </w:p>
         </w:tc>
@@ -1496,7 +1506,7 @@
           </w:tcPr>
           <w:p>
             <w:r>
-              <w:t>199.505</w:t>
+              <w:t>275.553</w:t>
             </w:r>
           </w:p>
         </w:tc>
@@ -1506,7 +1516,7 @@
           </w:tcPr>
           <w:p>
             <w:r>
-              <w:t>116.317</w:t>
+              <w:t>148.362</w:t>
             </w:r>
           </w:p>
         </w:tc>
@@ -1516,7 +1526,7 @@
           </w:tcPr>
           <w:p>
             <w:r>
-              <w:t>531.738</w:t>
+              <w:t>591.800</w:t>
             </w:r>
           </w:p>
         </w:tc>
@@ -1526,7 +1536,7 @@
           </w:tcPr>
           <w:p>
             <w:r>
-              <w:t>2028.190</w:t>
+              <w:t>2456.973</w:t>
             </w:r>
           </w:p>
         </w:tc>
@@ -1572,17 +1582,17 @@
     </w:p>
     <w:p>
       <w:r>
-        <w:t>N=5（短视，5 ms）完成：位移超调 5.295%，高密真实 P2 峰值 20.6532 MPa；有限网格压力可行恢复 6 次；经验证的移位计划再经有限网格改进 2 次。底层 OSQP 平均 0.534 ms，CVXPY 调用平均 3.264 ms，完整控制中位 32.076 ms。</w:t>
+        <w:t>N=5（短视，5 ms）完成：位移超调 1.919%，高密真实 P2 峰值 20.4063 MPa；有限网格压力可行恢复 2 次；经验证的移位计划再经有限网格改进 1 次。底层 OSQP 平均 0.229 ms，CVXPY 调用平均 2.822 ms，完整控制中位 24.719 ms。</w:t>
       </w:r>
     </w:p>
     <w:p>
       <w:r>
-        <w:t>N=20（基准，20 ms）完成：位移超调 0.466%，高密真实 P2 峰值 19.9020 MPa；有限网格压力可行恢复 0 次；经验证的移位计划再经有限网格改进 1 次。底层 OSQP 平均 5.636 ms，CVXPY 调用平均 9.051 ms，完整控制中位 64.548 ms。</w:t>
+        <w:t>N=20（基准，20 ms）完成：位移超调 0.617%，高密真实 P2 峰值 20.4941 MPa；有限网格压力可行恢复 0 次；经验证的移位计划再经有限网格改进 2 次。底层 OSQP 平均 8.053 ms，CVXPY 调用平均 11.071 ms，完整控制中位 97.209 ms。</w:t>
       </w:r>
     </w:p>
     <w:p>
       <w:r>
-        <w:t>N=50（长视，50 ms）完成：位移超调 0.360%，高密真实 P2 峰值 20.5629 MPa；有限网格压力可行恢复 1 次；经验证的移位计划再经有限网格改进 2 次。底层 OSQP 平均 116.317 ms，CVXPY 调用平均 120.934 ms，完整控制中位 119.544 ms。</w:t>
+        <w:t>N=50（长视，50 ms）完成：位移超调 0.965%，高密真实 P2 峰值 20.4090 MPa；有限网格压力可行恢复 0 次；经验证的移位计划再经有限网格改进 4 次。底层 OSQP 平均 148.362 ms，CVXPY 调用平均 152.647 ms，完整控制中位 164.276 ms。</w:t>
       </w:r>
     </w:p>
     <w:p>
@@ -1597,7 +1607,7 @@
     </w:p>
     <w:p>
       <w:r>
-        <w:t>与提供的课堂示意图相比，本回路的巡航与制动后 P2 基线更高。原因是当前四通阀的回油节流口与供油口采用相同系数，高速巡航需要回油压差；阀芯回中位后两腔封闭，且外泄漏系数为零，残余压力不能在几十毫秒内自动降回初始 2 MPa。参考图若体现近零巡航压力和快速卸压，需要另设回油/卸荷回路。本实验没有为匹配图形而修改压力数据、插入隐式卸压或裁剪峰值。</w:t>
+        <w:t>原闭中位对称计量口对象的巡航回油压差和制动后封闭腔压，与课堂示意图的低巡航压力及约 2 MPa 尾压差异较大。本次教学等效回路显式加入回油旁路与近静止压力调节支路来研究这一差异；图和表中的压力仍来自真实积分轨迹，未修改记录。该结果仅说明所声明回路假设下的响应，不能由图形反推出真实设备具有同一结构。</w:t>
       </w:r>
     </w:p>
     <w:p>

</xml_diff>